<commit_message>
Update S26 DST Course Description.docx
</commit_message>
<xml_diff>
--- a/ADMIN/S26 DST Course Description.docx
+++ b/ADMIN/S26 DST Course Description.docx
@@ -1081,15 +1081,7 @@
     </w:p>
     <w:p>
       <w:r>
-        <w:t xml:space="preserve">Students will be assessed through work on </w:t>
-      </w:r>
-      <w:proofErr w:type="spellStart"/>
-      <w:r>
-        <w:t>homeworks</w:t>
-      </w:r>
-      <w:proofErr w:type="spellEnd"/>
-      <w:r>
-        <w:t xml:space="preserve"> (40%), quizzes (40%), and projects(20%).</w:t>
+        <w:t>Students will be assessed through work on homeworks (40%), quizzes (40%), and projects(20%).</w:t>
       </w:r>
     </w:p>
     <w:p/>

</xml_diff>